<commit_message>
Reference audit corrections (refs 2, 3-6, 7, 8-16, 18)
- Ref 2: WHO Treatment of tuberculosis guidelines, 4th ed. 2010, ISBN 9789241547833
- Ref 7: RePORT-Brazil corrected to Mendelsohn SC et al., medRxiv 2025, doi 10.1101/2025.10.07.25337480
- Ref 11: Peng et al., Sci Rep 2024;14(1):6814, doi 10.1038/s41598-024-57446-8
- Ref 13: replaced unverifiable Ndhlovu with Krug S, Parveen S, Bishai WR, Front Immunol 2021;12:660916
- Ref 14: corrected author/volume to van Doorn CLR et al., EBioMedicine 2022;82:104173
- Added DOIs/issue numbers/page ranges to refs 3-6, 8-10, 12, 15-16, 18
- Updated benchmark table and DATA_PROVENANCE.md accordingly

Co-Authored-By: Claude Opus 4.8 <noreply@anthropic.com>
</commit_message>
<xml_diff>
--- a/DAI_Revision_2026/deliverables/Supplementary_Material_DAI_MajorRevision_v13.docx
+++ b/DAI_Revision_2026/deliverables/Supplementary_Material_DAI_MajorRevision_v13.docx
@@ -6125,7 +6125,7 @@
           </w:tcPr>
           <w:p>
             <w:r>
-              <w:t>Thompson 2017 (PMID 29050771)</w:t>
+              <w:t>Thompson 2017 (Tuberculosis 107:48-58)</w:t>
             </w:r>
           </w:p>
         </w:tc>
@@ -6145,7 +6145,7 @@
           </w:tcPr>
           <w:p>
             <w:r>
-              <w:t xml:space="preserve">~70 / ~ </w:t>
+              <w:t>~70</w:t>
             </w:r>
           </w:p>
         </w:tc>
@@ -6187,7 +6187,7 @@
           </w:tcPr>
           <w:p>
             <w:r>
-              <w:t>Vianello/TANDEM 2022 (PMID 35precip; GSE193979)</w:t>
+              <w:t>van Doorn/TANDEM 2022 (EBioMedicine 82:104173; GSE193979)</w:t>
             </w:r>
           </w:p>
         </w:tc>
@@ -6249,7 +6249,7 @@
           </w:tcPr>
           <w:p>
             <w:r>
-              <w:t>RePORT-Brazil 2025 (PMID 41282706)</w:t>
+              <w:t>Mendelsohn/RePORT-Brazil 2025 (medRxiv; PMID 41282706)</w:t>
             </w:r>
           </w:p>
         </w:tc>

</xml_diff>